<commit_message>
Milestone 1: meeting was held over Zoom; note stakeholder approved final report
</commit_message>
<xml_diff>
--- a/docs/milestone1/Group25_DataSage_Milestone1.docx
+++ b/docs/milestone1/Group25_DataSage_Milestone1.docx
@@ -501,7 +501,7 @@
         <w:t>Meeting:</w:t>
       </w:r>
       <w:r>
-        <w:t xml:space="preserve"> September 28, 2026, 4:00 to 5:30 PM (90 minutes), in person. Attendees: Vyshanth Buddani (stakeholder) and team members Shrey Bishnoi, Arsha Jindal, Ritik Agarwal, Vatsal Nirmal and Maulik Jadav.</w:t>
+        <w:t xml:space="preserve"> September 28, 2026, 4:00 to 5:30 PM (90 minutes), online over Zoom. Attendees: Vyshanth Buddani (stakeholder) and team members Shrey Bishnoi, Arsha Jindal, Ritik Agarwal, Vatsal Nirmal and Maulik Jadav.</w:t>
       </w:r>
     </w:p>
     <w:p>
@@ -1235,7 +1235,7 @@
         <w:t>Stakeholder confirmation.</w:t>
       </w:r>
       <w:r>
-        <w:t xml:space="preserve"> Vyshanth confirmed the refined scope, stakeholder decisions and initial success metrics during the meeting on September 28, 2026. Meeting notes are in Appendix A.</w:t>
+        <w:t xml:space="preserve"> Vyshanth confirmed the refined scope, stakeholder decisions and initial success metrics during the meeting on September 28, 2026. He later reviewed this final report and approved it. Meeting notes are in Appendix A.</w:t>
       </w:r>
     </w:p>
     <w:p>
@@ -5384,7 +5384,7 @@
         <w:t>Meeting:</w:t>
       </w:r>
       <w:r>
-        <w:t xml:space="preserve"> September 28, 2026, 4:00 to 5:30 PM, in person; Attendees: Vyshanth Buddani (stakeholder) and team members Shrey Bishnoi, Arsha Jindal, Ritik Agarwal, Vatsal Nirmal and Maulik Jadav.</w:t>
+        <w:t xml:space="preserve"> September 28, 2026, 4:00 to 5:30 PM, online over Zoom; Attendees: Vyshanth Buddani (stakeholder) and team members Shrey Bishnoi, Arsha Jindal, Ritik Agarwal, Vatsal Nirmal and Maulik Jadav.</w:t>
       </w:r>
     </w:p>
     <w:p>

</xml_diff>